<commit_message>
final text edit and knit
</commit_message>
<xml_diff>
--- a/final-analysis.docx
+++ b/final-analysis.docx
@@ -12,18 +12,10 @@
     </w:p>
     <w:p>
       <w:pPr>
-        <w:pStyle w:val="Author"/>
-      </w:pPr>
-      <w:r>
-        <w:t xml:space="preserve">Esther Lim, Ethan Sanders, Kamila Kwiatkowska</w:t>
-      </w:r>
-    </w:p>
-    <w:p>
-      <w:pPr>
         <w:pStyle w:val="Date"/>
       </w:pPr>
       <w:r>
-        <w:t xml:space="preserve">2026-04-19</w:t>
+        <w:t xml:space="preserve">2026-05-05</w:t>
       </w:r>
     </w:p>
     <w:bookmarkStart w:id="10" w:name="research-question"/>

</xml_diff>